<commit_message>
Se actualiza consolidado semana 3
</commit_message>
<xml_diff>
--- a/documentos/semana-3/consolidado-semana-3.docx
+++ b/documentos/semana-3/consolidado-semana-3.docx
@@ -415,17 +415,8 @@
           <w:b/>
           <w:bCs/>
         </w:rPr>
-        <w:t xml:space="preserve">Identificación de </w:t>
-      </w:r>
-      <w:proofErr w:type="spellStart"/>
-      <w:r>
-        <w:rPr>
-          <w:b/>
-          <w:bCs/>
-        </w:rPr>
-        <w:t>Stakeholders</w:t>
-      </w:r>
-      <w:proofErr w:type="spellEnd"/>
+        <w:t>Identificación de Stakeholders</w:t>
+      </w:r>
     </w:p>
     <w:p>
       <w:r>
@@ -1106,15 +1097,7 @@
         <w:t>Scrum:</w:t>
       </w:r>
       <w:r>
-        <w:t xml:space="preserve"> trabajo en </w:t>
-      </w:r>
-      <w:proofErr w:type="spellStart"/>
-      <w:r>
-        <w:t>sprints</w:t>
-      </w:r>
-      <w:proofErr w:type="spellEnd"/>
-      <w:r>
-        <w:t>.</w:t>
+        <w:t xml:space="preserve"> trabajo en sprints.</w:t>
       </w:r>
     </w:p>
     <w:p>
@@ -1297,7 +1280,6 @@
       <w:r>
         <w:t xml:space="preserve">, desarrollando el sistema en pequeñas entregas llamadas </w:t>
       </w:r>
-      <w:proofErr w:type="spellStart"/>
       <w:r>
         <w:rPr>
           <w:i/>
@@ -1305,7 +1287,6 @@
         </w:rPr>
         <w:t>sprints</w:t>
       </w:r>
-      <w:proofErr w:type="spellEnd"/>
       <w:r>
         <w:t>. Esto facilita avanzar por partes, recibir retroalimentación y realizar mejoras durante el proceso.</w:t>
       </w:r>
@@ -1466,107 +1447,27 @@
     <w:p>
       <w:r>
         <w:lastRenderedPageBreak/>
-        <w:t xml:space="preserve">Scrum, formalizado por Ken </w:t>
-      </w:r>
-      <w:proofErr w:type="spellStart"/>
-      <w:r>
-        <w:t>Schwaber</w:t>
-      </w:r>
-      <w:proofErr w:type="spellEnd"/>
-      <w:r>
-        <w:t xml:space="preserve"> y Jeff Sutherland, se basa en el desarrollo iterativo a través de ciclos cortos denominados </w:t>
-      </w:r>
-      <w:proofErr w:type="spellStart"/>
-      <w:r>
-        <w:t>Sprints</w:t>
-      </w:r>
-      <w:proofErr w:type="spellEnd"/>
-      <w:r>
-        <w:t>, los cuales generan incrementos funcionales del producto en periodos definidos. Este enfoque permite que el equipo entregue versiones parciales pero operativas del sistema desde etapas tempranas, lo que facilita la validación continua por parte de los interesados. Desde el punto de vista técnico, esto implica que los errores de diseño, arquitectura o implementación pueden detectarse y corregirse oportunamente, evitando que se acumulen problemas hasta fases finales del proyecto, como suele ocurrir en modelos tradicionales predictivos.</w:t>
-      </w:r>
-    </w:p>
-    <w:p>
-      <w:r>
-        <w:t xml:space="preserve">Una de las principales razones para utilizar Scrum es su capacidad para gestionar requisitos cambiantes sin comprometer la estabilidad del proyecto. A través del </w:t>
-      </w:r>
-      <w:proofErr w:type="spellStart"/>
-      <w:r>
-        <w:t>Product</w:t>
-      </w:r>
-      <w:proofErr w:type="spellEnd"/>
-      <w:r>
-        <w:t xml:space="preserve"> Backlog, los requerimientos pueden priorizarse y refinarse constantemente, lo que permite enfocar los esfuerzos del equipo en aquellas funcionalidades que generan mayor valor. Esta priorización dinámica optimiza el uso de recursos y asegura que el desarrollo esté alineado con las necesidades reales del cliente o usuario final. Además, al trabajar en iteraciones cortas, cualquier modificación en los requisitos puede incorporarse en el siguiente Sprint sin alterar significativamente la planificación global.</w:t>
-      </w:r>
-    </w:p>
-    <w:p>
-      <w:r>
-        <w:t xml:space="preserve">Desde la perspectiva de la gestión de riesgos, Scrum contribuye a minimizar la incertidumbre técnica y organizacional. La revisión constante del avance mediante reuniones como el </w:t>
-      </w:r>
-      <w:proofErr w:type="spellStart"/>
-      <w:r>
-        <w:t>Daily</w:t>
-      </w:r>
-      <w:proofErr w:type="spellEnd"/>
-      <w:r>
-        <w:t xml:space="preserve"> Scrum, la Sprint </w:t>
-      </w:r>
-      <w:proofErr w:type="spellStart"/>
-      <w:r>
-        <w:t>Review</w:t>
-      </w:r>
-      <w:proofErr w:type="spellEnd"/>
-      <w:r>
-        <w:t xml:space="preserve"> y la Sprint Retrospective permite inspeccionar el progreso y adaptar el plan de trabajo según los resultados obtenidos. Este ciclo continuo de inspección y adaptación favorece la mejora permanente del equipo y del producto, incrementando la probabilidad de éxito del proyecto. Asimismo, la transparencia promovida por Scrum facilita la trazabilidad del trabajo realizado y el seguimiento del cumplimiento de objetivos.</w:t>
-      </w:r>
-    </w:p>
-    <w:p>
-      <w:r>
-        <w:t>En términos de calidad, Scrum promueve la definición clara de criterios de aceptación y de una “</w:t>
-      </w:r>
-      <w:proofErr w:type="spellStart"/>
-      <w:r>
-        <w:t>Definition</w:t>
-      </w:r>
-      <w:proofErr w:type="spellEnd"/>
-      <w:r>
-        <w:t xml:space="preserve"> </w:t>
-      </w:r>
-      <w:proofErr w:type="spellStart"/>
-      <w:r>
-        <w:t>of</w:t>
-      </w:r>
-      <w:proofErr w:type="spellEnd"/>
-      <w:r>
-        <w:t xml:space="preserve"> Done”, lo que garantiza que cada incremento entregado cumpla estándares previamente establecidos. La integración frecuente y las pruebas continuas reducen la deuda técnica y mejoran la mantenibilidad del sistema. Este enfoque es especialmente relevante en proyectos académicos y profesionales donde el tiempo es limitado y la calidad del producto final es un criterio fundamental de evaluación.</w:t>
-      </w:r>
-    </w:p>
-    <w:p>
-      <w:r>
-        <w:t xml:space="preserve">Otro aspecto relevante es la estructura organizativa que propone Scrum, la cual define roles claros como </w:t>
-      </w:r>
-      <w:proofErr w:type="spellStart"/>
-      <w:r>
-        <w:t>Product</w:t>
-      </w:r>
-      <w:proofErr w:type="spellEnd"/>
-      <w:r>
-        <w:t xml:space="preserve"> </w:t>
-      </w:r>
-      <w:proofErr w:type="spellStart"/>
-      <w:r>
-        <w:t>Owner</w:t>
-      </w:r>
-      <w:proofErr w:type="spellEnd"/>
-      <w:r>
-        <w:t xml:space="preserve">, Scrum </w:t>
-      </w:r>
-      <w:proofErr w:type="gramStart"/>
-      <w:r>
-        <w:t>Master</w:t>
-      </w:r>
-      <w:proofErr w:type="gramEnd"/>
-      <w:r>
-        <w:t xml:space="preserve"> y Equipo de Desarrollo. Esta definición de responsabilidades mejora la coordinación, fomenta la autoorganización y fortalece la comunicación dentro del grupo de trabajo. En proyectos colaborativos, esta claridad organizacional reduce conflictos, evita duplicidad de tareas y facilita la toma de decisiones, aspectos clave para cumplir con los plazos establecidos.</w:t>
+        <w:t>Scrum, formalizado por Ken Schwaber y Jeff Sutherland, se basa en el desarrollo iterativo a través de ciclos cortos denominados Sprints, los cuales generan incrementos funcionales del producto en periodos definidos. Este enfoque permite que el equipo entregue versiones parciales pero operativas del sistema desde etapas tempranas, lo que facilita la validación continua por parte de los interesados. Desde el punto de vista técnico, esto implica que los errores de diseño, arquitectura o implementación pueden detectarse y corregirse oportunamente, evitando que se acumulen problemas hasta fases finales del proyecto, como suele ocurrir en modelos tradicionales predictivos.</w:t>
+      </w:r>
+    </w:p>
+    <w:p>
+      <w:r>
+        <w:t>Una de las principales razones para utilizar Scrum es su capacidad para gestionar requisitos cambiantes sin comprometer la estabilidad del proyecto. A través del Product Backlog, los requerimientos pueden priorizarse y refinarse constantemente, lo que permite enfocar los esfuerzos del equipo en aquellas funcionalidades que generan mayor valor. Esta priorización dinámica optimiza el uso de recursos y asegura que el desarrollo esté alineado con las necesidades reales del cliente o usuario final. Además, al trabajar en iteraciones cortas, cualquier modificación en los requisitos puede incorporarse en el siguiente Sprint sin alterar significativamente la planificación global.</w:t>
+      </w:r>
+    </w:p>
+    <w:p>
+      <w:r>
+        <w:t>Desde la perspectiva de la gestión de riesgos, Scrum contribuye a minimizar la incertidumbre técnica y organizacional. La revisión constante del avance mediante reuniones como el Daily Scrum, la Sprint Review y la Sprint Retrospective permite inspeccionar el progreso y adaptar el plan de trabajo según los resultados obtenidos. Este ciclo continuo de inspección y adaptación favorece la mejora permanente del equipo y del producto, incrementando la probabilidad de éxito del proyecto. Asimismo, la transparencia promovida por Scrum facilita la trazabilidad del trabajo realizado y el seguimiento del cumplimiento de objetivos.</w:t>
+      </w:r>
+    </w:p>
+    <w:p>
+      <w:r>
+        <w:t>En términos de calidad, Scrum promueve la definición clara de criterios de aceptación y de una “Definition of Done”, lo que garantiza que cada incremento entregado cumpla estándares previamente establecidos. La integración frecuente y las pruebas continuas reducen la deuda técnica y mejoran la mantenibilidad del sistema. Este enfoque es especialmente relevante en proyectos académicos y profesionales donde el tiempo es limitado y la calidad del producto final es un criterio fundamental de evaluación.</w:t>
+      </w:r>
+    </w:p>
+    <w:p>
+      <w:r>
+        <w:t>Otro aspecto relevante es la estructura organizativa que propone Scrum, la cual define roles claros como Product Owner, Scrum Master y Equipo de Desarrollo. Esta definición de responsabilidades mejora la coordinación, fomenta la autoorganización y fortalece la comunicación dentro del grupo de trabajo. En proyectos colaborativos, esta claridad organizacional reduce conflictos, evita duplicidad de tareas y facilita la toma de decisiones, aspectos clave para cumplir con los plazos establecidos.</w:t>
       </w:r>
     </w:p>
     <w:p>
@@ -1754,21 +1655,7 @@
         <w:rPr>
           <w:lang w:val="es-GT"/>
         </w:rPr>
-        <w:t xml:space="preserve">Scrum es un marco de trabajo ágil que divide el proyecto en ciclos cortos llamados </w:t>
-      </w:r>
-      <w:proofErr w:type="spellStart"/>
-      <w:r>
-        <w:rPr>
-          <w:lang w:val="es-GT"/>
-        </w:rPr>
-        <w:t>sprints</w:t>
-      </w:r>
-      <w:proofErr w:type="spellEnd"/>
-      <w:r>
-        <w:rPr>
-          <w:lang w:val="es-GT"/>
-        </w:rPr>
-        <w:t>. Es muy utilizado porque facilita la organización del equipo y permite entregar avances frecuentes.</w:t>
+        <w:t>Scrum es un marco de trabajo ágil que divide el proyecto en ciclos cortos llamados sprints. Es muy utilizado porque facilita la organización del equipo y permite entregar avances frecuentes.</w:t>
       </w:r>
     </w:p>
     <w:p>
@@ -1816,25 +1703,7 @@
           <w:bCs/>
           <w:lang w:val="es-GT"/>
         </w:rPr>
-        <w:t xml:space="preserve">7. ¿Qué es el </w:t>
-      </w:r>
-      <w:proofErr w:type="spellStart"/>
-      <w:r>
-        <w:rPr>
-          <w:b/>
-          <w:bCs/>
-          <w:lang w:val="es-GT"/>
-        </w:rPr>
-        <w:t>Product</w:t>
-      </w:r>
-      <w:proofErr w:type="spellEnd"/>
-      <w:r>
-        <w:rPr>
-          <w:b/>
-          <w:bCs/>
-          <w:lang w:val="es-GT"/>
-        </w:rPr>
-        <w:t xml:space="preserve"> Backlog?</w:t>
+        <w:t>7. ¿Qué es el Product Backlog?</w:t>
       </w:r>
       <w:r>
         <w:rPr>
@@ -1848,88 +1717,24 @@
         <w:rPr>
           <w:lang w:val="es-GT"/>
         </w:rPr>
-        <w:t xml:space="preserve">Es una lista ordenada de todas las tareas, requisitos o mejoras pendientes del proyecto. El </w:t>
-      </w:r>
-      <w:proofErr w:type="spellStart"/>
-      <w:r>
-        <w:rPr>
-          <w:lang w:val="es-GT"/>
-        </w:rPr>
-        <w:t>Product</w:t>
-      </w:r>
-      <w:proofErr w:type="spellEnd"/>
-      <w:r>
-        <w:rPr>
-          <w:lang w:val="es-GT"/>
-        </w:rPr>
-        <w:t xml:space="preserve"> </w:t>
-      </w:r>
-      <w:proofErr w:type="spellStart"/>
-      <w:r>
-        <w:rPr>
-          <w:lang w:val="es-GT"/>
-        </w:rPr>
-        <w:t>Owner</w:t>
-      </w:r>
-      <w:proofErr w:type="spellEnd"/>
-      <w:r>
-        <w:rPr>
-          <w:lang w:val="es-GT"/>
-        </w:rPr>
-        <w:t xml:space="preserve"> se encarga de priorizarla según el valor que aporta cada elemento.</w:t>
-      </w:r>
-    </w:p>
-    <w:p>
-      <w:pPr>
-        <w:rPr>
-          <w:b/>
-          <w:bCs/>
-          <w:lang w:val="es-GT"/>
-        </w:rPr>
-      </w:pPr>
-      <w:r>
-        <w:rPr>
-          <w:b/>
-          <w:bCs/>
-          <w:lang w:val="es-GT"/>
-        </w:rPr>
-        <w:t xml:space="preserve">8. ¿Cuál es el rol del </w:t>
-      </w:r>
-      <w:proofErr w:type="spellStart"/>
-      <w:r>
-        <w:rPr>
-          <w:b/>
-          <w:bCs/>
-          <w:lang w:val="es-GT"/>
-        </w:rPr>
-        <w:t>Product</w:t>
-      </w:r>
-      <w:proofErr w:type="spellEnd"/>
-      <w:r>
-        <w:rPr>
-          <w:b/>
-          <w:bCs/>
-          <w:lang w:val="es-GT"/>
-        </w:rPr>
-        <w:t xml:space="preserve"> </w:t>
-      </w:r>
-      <w:proofErr w:type="spellStart"/>
-      <w:r>
-        <w:rPr>
-          <w:b/>
-          <w:bCs/>
-          <w:lang w:val="es-GT"/>
-        </w:rPr>
-        <w:t>Owner</w:t>
-      </w:r>
-      <w:proofErr w:type="spellEnd"/>
-      <w:r>
-        <w:rPr>
-          <w:b/>
-          <w:bCs/>
-          <w:lang w:val="es-GT"/>
-        </w:rPr>
-        <w:t>?</w:t>
+        <w:t>Es una lista ordenada de todas las tareas, requisitos o mejoras pendientes del proyecto. El Product Owner se encarga de priorizarla según el valor que aporta cada elemento.</w:t>
+      </w:r>
+    </w:p>
+    <w:p>
+      <w:pPr>
+        <w:rPr>
+          <w:b/>
+          <w:bCs/>
+          <w:lang w:val="es-GT"/>
+        </w:rPr>
+      </w:pPr>
+      <w:r>
+        <w:rPr>
+          <w:b/>
+          <w:bCs/>
+          <w:lang w:val="es-GT"/>
+        </w:rPr>
+        <w:t>8. ¿Cuál es el rol del Product Owner?</w:t>
       </w:r>
       <w:r>
         <w:rPr>
@@ -1960,25 +1765,7 @@
           <w:bCs/>
           <w:lang w:val="es-GT"/>
         </w:rPr>
-        <w:t xml:space="preserve">9. ¿Qué función cumple el Scrum </w:t>
-      </w:r>
-      <w:proofErr w:type="gramStart"/>
-      <w:r>
-        <w:rPr>
-          <w:b/>
-          <w:bCs/>
-          <w:lang w:val="es-GT"/>
-        </w:rPr>
-        <w:t>Master</w:t>
-      </w:r>
-      <w:proofErr w:type="gramEnd"/>
-      <w:r>
-        <w:rPr>
-          <w:b/>
-          <w:bCs/>
-          <w:lang w:val="es-GT"/>
-        </w:rPr>
-        <w:t>?</w:t>
+        <w:t>9. ¿Qué función cumple el Scrum Master?</w:t>
       </w:r>
       <w:r>
         <w:rPr>
@@ -1992,21 +1779,7 @@
         <w:rPr>
           <w:lang w:val="es-GT"/>
         </w:rPr>
-        <w:t xml:space="preserve">El Scrum </w:t>
-      </w:r>
-      <w:proofErr w:type="gramStart"/>
-      <w:r>
-        <w:rPr>
-          <w:lang w:val="es-GT"/>
-        </w:rPr>
-        <w:t>Master</w:t>
-      </w:r>
-      <w:proofErr w:type="gramEnd"/>
-      <w:r>
-        <w:rPr>
-          <w:lang w:val="es-GT"/>
-        </w:rPr>
-        <w:t xml:space="preserve"> guía al equipo en el uso correcto de la metodología, elimina obstáculos y promueve buenas prácticas dentro del proceso.</w:t>
+        <w:t>El Scrum Master guía al equipo en el uso correcto de la metodología, elimina obstáculos y promueve buenas prácticas dentro del proceso.</w:t>
       </w:r>
     </w:p>
     <w:p>
@@ -2117,25 +1890,7 @@
           <w:bCs/>
           <w:lang w:val="es-GT"/>
         </w:rPr>
-        <w:t xml:space="preserve">13. ¿Qué es una reunión </w:t>
-      </w:r>
-      <w:proofErr w:type="spellStart"/>
-      <w:r>
-        <w:rPr>
-          <w:b/>
-          <w:bCs/>
-          <w:lang w:val="es-GT"/>
-        </w:rPr>
-        <w:t>Daily</w:t>
-      </w:r>
-      <w:proofErr w:type="spellEnd"/>
-      <w:r>
-        <w:rPr>
-          <w:b/>
-          <w:bCs/>
-          <w:lang w:val="es-GT"/>
-        </w:rPr>
-        <w:t xml:space="preserve"> Scrum?</w:t>
+        <w:t>13. ¿Qué es una reunión Daily Scrum?</w:t>
       </w:r>
       <w:r>
         <w:rPr>
@@ -4025,14 +3780,333 @@
         <w:t>El horario vuelve a mostrarse como disponible.</w:t>
       </w:r>
     </w:p>
-    <w:p/>
-    <w:p>
-      <w:pPr>
-        <w:rPr>
-          <w:b/>
-          <w:bCs/>
-        </w:rPr>
-      </w:pPr>
+    <w:p>
+      <w:pPr>
+        <w:rPr>
+          <w:b/>
+          <w:bCs/>
+        </w:rPr>
+      </w:pPr>
+    </w:p>
+    <w:p>
+      <w:pPr>
+        <w:rPr>
+          <w:b/>
+          <w:bCs/>
+        </w:rPr>
+      </w:pPr>
+      <w:r>
+        <w:rPr>
+          <w:b/>
+          <w:bCs/>
+        </w:rPr>
+        <w:t>5</w:t>
+      </w:r>
+      <w:r>
+        <w:rPr>
+          <w:b/>
+          <w:bCs/>
+        </w:rPr>
+        <w:t xml:space="preserve">. </w:t>
+      </w:r>
+      <w:r>
+        <w:rPr>
+          <w:b/>
+          <w:bCs/>
+        </w:rPr>
+        <w:t>Laboratorio practico</w:t>
+      </w:r>
+    </w:p>
+    <w:p>
+      <w:pPr>
+        <w:rPr>
+          <w:b/>
+          <w:bCs/>
+        </w:rPr>
+      </w:pPr>
+      <w:r>
+        <w:rPr>
+          <w:b/>
+          <w:bCs/>
+        </w:rPr>
+        <w:t>5.1 Documentación en Markdown</w:t>
+      </w:r>
+    </w:p>
+    <w:p>
+      <w:pPr>
+        <w:rPr>
+          <w:b/>
+          <w:bCs/>
+        </w:rPr>
+      </w:pPr>
+      <w:r>
+        <w:rPr>
+          <w:b/>
+          <w:bCs/>
+        </w:rPr>
+        <w:drawing>
+          <wp:inline distT="0" distB="0" distL="0" distR="0" wp14:anchorId="4B333119" wp14:editId="4D1F275B">
+            <wp:extent cx="5943600" cy="1994535"/>
+            <wp:effectExtent l="0" t="0" r="0" b="5715"/>
+            <wp:docPr id="1761448927" name="Imagen 1"/>
+            <wp:cNvGraphicFramePr>
+              <a:graphicFrameLocks xmlns:a="http://schemas.openxmlformats.org/drawingml/2006/main" noChangeAspect="1"/>
+            </wp:cNvGraphicFramePr>
+            <a:graphic xmlns:a="http://schemas.openxmlformats.org/drawingml/2006/main">
+              <a:graphicData uri="http://schemas.openxmlformats.org/drawingml/2006/picture">
+                <pic:pic xmlns:pic="http://schemas.openxmlformats.org/drawingml/2006/picture">
+                  <pic:nvPicPr>
+                    <pic:cNvPr id="1761448927" name=""/>
+                    <pic:cNvPicPr/>
+                  </pic:nvPicPr>
+                  <pic:blipFill>
+                    <a:blip r:embed="rId9"/>
+                    <a:stretch>
+                      <a:fillRect/>
+                    </a:stretch>
+                  </pic:blipFill>
+                  <pic:spPr>
+                    <a:xfrm>
+                      <a:off x="0" y="0"/>
+                      <a:ext cx="5943600" cy="1994535"/>
+                    </a:xfrm>
+                    <a:prstGeom prst="rect">
+                      <a:avLst/>
+                    </a:prstGeom>
+                  </pic:spPr>
+                </pic:pic>
+              </a:graphicData>
+            </a:graphic>
+          </wp:inline>
+        </w:drawing>
+      </w:r>
+    </w:p>
+    <w:p>
+      <w:pPr>
+        <w:rPr>
+          <w:b/>
+          <w:bCs/>
+        </w:rPr>
+      </w:pPr>
+      <w:r>
+        <w:rPr>
+          <w:b/>
+          <w:bCs/>
+        </w:rPr>
+        <w:drawing>
+          <wp:inline distT="0" distB="0" distL="0" distR="0" wp14:anchorId="6AFE486D" wp14:editId="6D5B0B55">
+            <wp:extent cx="5943600" cy="1885315"/>
+            <wp:effectExtent l="0" t="0" r="0" b="635"/>
+            <wp:docPr id="1831097445" name="Imagen 1"/>
+            <wp:cNvGraphicFramePr>
+              <a:graphicFrameLocks xmlns:a="http://schemas.openxmlformats.org/drawingml/2006/main" noChangeAspect="1"/>
+            </wp:cNvGraphicFramePr>
+            <a:graphic xmlns:a="http://schemas.openxmlformats.org/drawingml/2006/main">
+              <a:graphicData uri="http://schemas.openxmlformats.org/drawingml/2006/picture">
+                <pic:pic xmlns:pic="http://schemas.openxmlformats.org/drawingml/2006/picture">
+                  <pic:nvPicPr>
+                    <pic:cNvPr id="1831097445" name=""/>
+                    <pic:cNvPicPr/>
+                  </pic:nvPicPr>
+                  <pic:blipFill>
+                    <a:blip r:embed="rId10"/>
+                    <a:stretch>
+                      <a:fillRect/>
+                    </a:stretch>
+                  </pic:blipFill>
+                  <pic:spPr>
+                    <a:xfrm>
+                      <a:off x="0" y="0"/>
+                      <a:ext cx="5943600" cy="1885315"/>
+                    </a:xfrm>
+                    <a:prstGeom prst="rect">
+                      <a:avLst/>
+                    </a:prstGeom>
+                  </pic:spPr>
+                </pic:pic>
+              </a:graphicData>
+            </a:graphic>
+          </wp:inline>
+        </w:drawing>
+      </w:r>
+    </w:p>
+    <w:p>
+      <w:pPr>
+        <w:rPr>
+          <w:b/>
+          <w:bCs/>
+        </w:rPr>
+      </w:pPr>
+      <w:r>
+        <w:rPr>
+          <w:b/>
+          <w:bCs/>
+        </w:rPr>
+        <w:t>5.2 Control de versiones en GIT</w:t>
+      </w:r>
+    </w:p>
+    <w:p>
+      <w:pPr>
+        <w:rPr>
+          <w:b/>
+          <w:bCs/>
+        </w:rPr>
+      </w:pPr>
+      <w:r>
+        <w:rPr>
+          <w:b/>
+          <w:bCs/>
+        </w:rPr>
+        <w:lastRenderedPageBreak/>
+        <w:drawing>
+          <wp:inline distT="0" distB="0" distL="0" distR="0" wp14:anchorId="4B654F6F" wp14:editId="5C72FF19">
+            <wp:extent cx="5943600" cy="1890395"/>
+            <wp:effectExtent l="0" t="0" r="0" b="0"/>
+            <wp:docPr id="94055417" name="Imagen 1"/>
+            <wp:cNvGraphicFramePr>
+              <a:graphicFrameLocks xmlns:a="http://schemas.openxmlformats.org/drawingml/2006/main" noChangeAspect="1"/>
+            </wp:cNvGraphicFramePr>
+            <a:graphic xmlns:a="http://schemas.openxmlformats.org/drawingml/2006/main">
+              <a:graphicData uri="http://schemas.openxmlformats.org/drawingml/2006/picture">
+                <pic:pic xmlns:pic="http://schemas.openxmlformats.org/drawingml/2006/picture">
+                  <pic:nvPicPr>
+                    <pic:cNvPr id="94055417" name=""/>
+                    <pic:cNvPicPr/>
+                  </pic:nvPicPr>
+                  <pic:blipFill>
+                    <a:blip r:embed="rId11"/>
+                    <a:stretch>
+                      <a:fillRect/>
+                    </a:stretch>
+                  </pic:blipFill>
+                  <pic:spPr>
+                    <a:xfrm>
+                      <a:off x="0" y="0"/>
+                      <a:ext cx="5943600" cy="1890395"/>
+                    </a:xfrm>
+                    <a:prstGeom prst="rect">
+                      <a:avLst/>
+                    </a:prstGeom>
+                  </pic:spPr>
+                </pic:pic>
+              </a:graphicData>
+            </a:graphic>
+          </wp:inline>
+        </w:drawing>
+      </w:r>
+    </w:p>
+    <w:p>
+      <w:pPr>
+        <w:rPr>
+          <w:b/>
+          <w:bCs/>
+        </w:rPr>
+      </w:pPr>
+      <w:r>
+        <w:rPr>
+          <w:b/>
+          <w:bCs/>
+        </w:rPr>
+        <w:t>5.3 Evidencia de commits</w:t>
+      </w:r>
+    </w:p>
+    <w:p>
+      <w:pPr>
+        <w:rPr>
+          <w:b/>
+          <w:bCs/>
+        </w:rPr>
+      </w:pPr>
+      <w:r>
+        <w:rPr>
+          <w:b/>
+          <w:bCs/>
+        </w:rPr>
+        <w:drawing>
+          <wp:inline distT="0" distB="0" distL="0" distR="0" wp14:anchorId="5484A2E6" wp14:editId="6674199D">
+            <wp:extent cx="5943600" cy="2459990"/>
+            <wp:effectExtent l="0" t="0" r="0" b="0"/>
+            <wp:docPr id="866977460" name="Imagen 1"/>
+            <wp:cNvGraphicFramePr>
+              <a:graphicFrameLocks xmlns:a="http://schemas.openxmlformats.org/drawingml/2006/main" noChangeAspect="1"/>
+            </wp:cNvGraphicFramePr>
+            <a:graphic xmlns:a="http://schemas.openxmlformats.org/drawingml/2006/main">
+              <a:graphicData uri="http://schemas.openxmlformats.org/drawingml/2006/picture">
+                <pic:pic xmlns:pic="http://schemas.openxmlformats.org/drawingml/2006/picture">
+                  <pic:nvPicPr>
+                    <pic:cNvPr id="866977460" name=""/>
+                    <pic:cNvPicPr/>
+                  </pic:nvPicPr>
+                  <pic:blipFill>
+                    <a:blip r:embed="rId12"/>
+                    <a:stretch>
+                      <a:fillRect/>
+                    </a:stretch>
+                  </pic:blipFill>
+                  <pic:spPr>
+                    <a:xfrm>
+                      <a:off x="0" y="0"/>
+                      <a:ext cx="5943600" cy="2459990"/>
+                    </a:xfrm>
+                    <a:prstGeom prst="rect">
+                      <a:avLst/>
+                    </a:prstGeom>
+                  </pic:spPr>
+                </pic:pic>
+              </a:graphicData>
+            </a:graphic>
+          </wp:inline>
+        </w:drawing>
+      </w:r>
+    </w:p>
+    <w:p>
+      <w:pPr>
+        <w:rPr>
+          <w:b/>
+          <w:bCs/>
+        </w:rPr>
+      </w:pPr>
+      <w:r>
+        <w:rPr>
+          <w:b/>
+          <w:bCs/>
+        </w:rPr>
+        <w:drawing>
+          <wp:inline distT="0" distB="0" distL="0" distR="0" wp14:anchorId="196464C5" wp14:editId="29C27081">
+            <wp:extent cx="5943600" cy="3091180"/>
+            <wp:effectExtent l="0" t="0" r="0" b="0"/>
+            <wp:docPr id="1960098485" name="Imagen 1"/>
+            <wp:cNvGraphicFramePr>
+              <a:graphicFrameLocks xmlns:a="http://schemas.openxmlformats.org/drawingml/2006/main" noChangeAspect="1"/>
+            </wp:cNvGraphicFramePr>
+            <a:graphic xmlns:a="http://schemas.openxmlformats.org/drawingml/2006/main">
+              <a:graphicData uri="http://schemas.openxmlformats.org/drawingml/2006/picture">
+                <pic:pic xmlns:pic="http://schemas.openxmlformats.org/drawingml/2006/picture">
+                  <pic:nvPicPr>
+                    <pic:cNvPr id="1960098485" name=""/>
+                    <pic:cNvPicPr/>
+                  </pic:nvPicPr>
+                  <pic:blipFill>
+                    <a:blip r:embed="rId13"/>
+                    <a:stretch>
+                      <a:fillRect/>
+                    </a:stretch>
+                  </pic:blipFill>
+                  <pic:spPr>
+                    <a:xfrm>
+                      <a:off x="0" y="0"/>
+                      <a:ext cx="5943600" cy="3091180"/>
+                    </a:xfrm>
+                    <a:prstGeom prst="rect">
+                      <a:avLst/>
+                    </a:prstGeom>
+                  </pic:spPr>
+                </pic:pic>
+              </a:graphicData>
+            </a:graphic>
+          </wp:inline>
+        </w:drawing>
+      </w:r>
     </w:p>
     <w:sectPr>
       <w:pgSz w:w="12240" w:h="15840"/>

</xml_diff>